<commit_message>
docs(forms): 5-practice rules + hotel golf air clauses
</commit_message>
<xml_diff>
--- a/docs-forms/01_견적서.docx
+++ b/docs-forms/01_견적서.docx
@@ -18,6 +18,59 @@
       </w:pPr>
       <w:r>
         <w:t>01. 희망여행(맞춤형) 견적서</w:t>
+      </w:r>
+    </w:p>
+    <w:p>
+      <w:pPr>
+        <w:pStyle w:val="Heading2"/>
+      </w:pPr>
+      <w:r>
+        <w:t>실무 5대 수칙 (담당자 준수사항)</w:t>
+      </w:r>
+    </w:p>
+    <w:p>
+      <w:pPr>
+        <w:pStyle w:val="ListBullet"/>
+      </w:pPr>
+      <w:r>
+        <w:t>(1) PC 비밀번호·백신을 최신으로 유지합니다 (개인정보보호법 제29조 안전조치의무, 위반 시 5천만원 이하 과태료).</w:t>
+      </w:r>
+    </w:p>
+    <w:p>
+      <w:pPr>
+        <w:pStyle w:val="ListBullet"/>
+      </w:pPr>
+      <w:r>
+        <w:t>(2) 카드번호·CVC를 카톡·종이에 남기지 않고 즉시 파기하며, PG 승인번호만 보관합니다 (여신전문금융업법 제70조, 위반 시 7년 이하 징역 또는 5천만원 이하 벌금, CVC 저장은 절대 금지).</w:t>
+      </w:r>
+    </w:p>
+    <w:p>
+      <w:pPr>
+        <w:pStyle w:val="ListBullet"/>
+      </w:pPr>
+      <w:r>
+        <w:t>(3) 여권사본을 폰 갤러리에 두지 말고 암호폴더에 보관하며, 예약 완료 후 즉시 삭제합니다 (고유식별정보는 별도 동의+암호화, 개인정보보호법 제71조 위반 시 5년 이하 징역 또는 5천만원 이하 벌금).</w:t>
+      </w:r>
+    </w:p>
+    <w:p>
+      <w:pPr>
+        <w:pStyle w:val="ListBullet"/>
+      </w:pPr>
+      <w:r>
+        <w:t>(4) 결제 전에 여행약관 동의와 제3자 제공 동의를 별도 체크박스로 분리해 받습니다 (미동의 상태로 처리 시 형사처벌 대상이 될 수 있습니다).</w:t>
+      </w:r>
+    </w:p>
+    <w:p>
+      <w:pPr>
+        <w:pStyle w:val="ListBullet"/>
+      </w:pPr>
+      <w:r>
+        <w:t>(5) 마케팅 문자는 별도 동의한 고객에게만 보내며, 매건 (광고) 표기와 수신거부 안내를 넣고 21시~8시에는 발송하지 않습니다 (정보통신망법, 위반 시 3천만원 이하 과태료).</w:t>
+      </w:r>
+    </w:p>
+    <w:p>
+      <w:r>
+        <w:br w:type="page"/>
       </w:r>
     </w:p>
     <w:p>

</xml_diff>

<commit_message>
docs(forms): rebuilt 7 travel docs per ops board
</commit_message>
<xml_diff>
--- a/docs-forms/01_견적서.docx
+++ b/docs-forms/01_견적서.docx
@@ -17,7 +17,7 @@
         <w:pStyle w:val="Heading1"/>
       </w:pPr>
       <w:r>
-        <w:t>01. 희망여행(맞춤형) 견적서</w:t>
+        <w:t>01. 맞춤여행(개별 알선) 견적서</w:t>
       </w:r>
     </w:p>
     <w:p>
@@ -154,7 +154,7 @@
               <w:rPr>
                 <w:sz w:val="18"/>
               </w:rPr>
-              <w:t>희망여행(맞춤형, 여행자가 요청한 일정에 따른 알선)</w:t>
+              <w:t>맞춤여행(개별 알선, 여행자가 요청한 일정에 따름)</w:t>
             </w:r>
           </w:p>
         </w:tc>
@@ -965,7 +965,7 @@
         <w:pStyle w:val="ListBullet"/>
       </w:pPr>
       <w:r>
-        <w:t>계약금은 총 여행요금의 10% 이하로 받습니다.</w:t>
+        <w:t>예약금(계약금)은 미화 500달러 고정으로 받습니다 (소액 여행에서 10%를 초과할 수 있으며, 실손해 공제 후 정산합니다).</w:t>
       </w:r>
     </w:p>
     <w:p>
@@ -973,7 +973,7 @@
         <w:pStyle w:val="ListBullet"/>
       </w:pPr>
       <w:r>
-        <w:t>잔금은 출발 7일 전까지 납부합니다 (국외여행 표준약관 제11조 기준).</w:t>
+        <w:t>잔금은 출발 7일 전까지 납부합니다 (국외여행 표준약관 제12조 기준, 계좌이체 또는 카드 — 카드 시 수수료 별도 안내). 출발이 7일 이내로 임박한 경우 잔금은 계약과 동시에 전액 납부합니다. 요금이 확정 후 변동되면 잔금에 반영합니다.</w:t>
       </w:r>
     </w:p>
     <w:p>
@@ -981,7 +981,7 @@
         <w:pStyle w:val="ListBullet"/>
       </w:pPr>
       <w:r>
-        <w:t>결제는 포트원 결제링크와 계좌이체로 받습니다. 두 가지 중 편한 방식을 고르시면 됩니다.</w:t>
+        <w:t>결제는 포트원 결제링크(페이업 경유 예정)와 계좌이체 또는 카드로 받습니다. 세 가지 중 편한 방식을 고르시면 됩니다.</w:t>
       </w:r>
     </w:p>
     <w:p>
@@ -1275,7 +1275,7 @@
         <w:pStyle w:val="Heading2"/>
       </w:pPr>
       <w:r>
-        <w:t>8. 최저인원 안내</w:t>
+        <w:t>8. 최소출발인원 없음</w:t>
       </w:r>
     </w:p>
     <w:p>
@@ -1283,15 +1283,7 @@
         <w:pStyle w:val="ListBullet"/>
       </w:pPr>
       <w:r>
-        <w:t>출발 인원이 최저인원에 못 미치면 출발 7일 전까지 안내드리고 계약을 해제할 수 있습니다.</w:t>
-      </w:r>
-    </w:p>
-    <w:p>
-      <w:pPr>
-        <w:pStyle w:val="ListBullet"/>
-      </w:pPr>
-      <w:r>
-        <w:t>이 기한을 지키지 못한 경우, 출발 1일 전 통보는 여행요금의 30%, 출발 당일 통보는 50%를 배상합니다.</w:t>
+        <w:t>본 상품은 1인 맞춤여행으로 최소출발인원이 없으며, 모집·출발확정·잔여석 판매를 하지 않습니다.</w:t>
       </w:r>
     </w:p>
     <w:p/>
@@ -1328,7 +1320,7 @@
           <w:color w:val="444444"/>
           <w:sz w:val="17"/>
         </w:rPr>
-        <w:t>영업보증보험 3,000만원 가입 | 기획여행 미취급 · 희망여행(맞춤형만) 취급</w:t>
+        <w:t>영업보증보험 3,000만원 가입 | 기획여행 미취급 · 맞춤여행(개별 알선만) 취급</w:t>
       </w:r>
     </w:p>
     <w:sectPr>

</xml_diff>